<commit_message>
chore(material): H/I (Datenmodell, Fallbeispiele) aus glossar-final.docx entfernt
Alles nach dem Literaturverzeichnis geloescht -> .docx deckt sich mit der Demo (A-G).
Formaterhaltend via lxml, sectPr erhalten, Zip-Integritaet geprueft. Demo unberuehrt
(Build liest das .docx nicht).

Co-Authored-By: Claude Opus 4.8 (1M context) <noreply@anthropic.com>
</commit_message>
<xml_diff>
--- a/specs/material/glossar-final.docx
+++ b/specs/material/glossar-final.docx
@@ -7149,3106 +7149,6 @@
           <w:szCs w:val="22"/>
         </w:rPr>
         <w:t>).</w:t>
-      </w:r>
-    </w:p>
-    <w:p>
-      <w:pPr>
-        <w:rPr>
-          <w:color w:val="000000" w:themeColor="text1"/>
-          <w:sz w:val="22"/>
-          <w:szCs w:val="22"/>
-        </w:rPr>
-      </w:pPr>
-    </w:p>
-    <w:p>
-      <w:pPr>
-        <w:rPr>
-          <w:b/>
-          <w:bCs/>
-          <w:sz w:val="22"/>
-          <w:szCs w:val="22"/>
-        </w:rPr>
-      </w:pPr>
-      <w:r>
-        <w:rPr>
-          <w:b/>
-          <w:bCs/>
-          <w:sz w:val="22"/>
-          <w:szCs w:val="22"/>
-        </w:rPr>
-        <w:br w:type="page"/>
-      </w:r>
-    </w:p>
-    <w:p>
-      <w:pPr>
-        <w:rPr>
-          <w:b/>
-          <w:bCs/>
-          <w:sz w:val="22"/>
-          <w:szCs w:val="22"/>
-        </w:rPr>
-      </w:pPr>
-      <w:r>
-        <w:rPr>
-          <w:b/>
-          <w:bCs/>
-          <w:sz w:val="22"/>
-          <w:szCs w:val="22"/>
-        </w:rPr>
-        <w:lastRenderedPageBreak/>
-        <w:t>H</w:t>
-      </w:r>
-      <w:r>
-        <w:rPr>
-          <w:b/>
-          <w:bCs/>
-          <w:sz w:val="22"/>
-          <w:szCs w:val="22"/>
-        </w:rPr>
-        <w:t xml:space="preserve">. </w:t>
-      </w:r>
-      <w:r>
-        <w:rPr>
-          <w:b/>
-          <w:bCs/>
-          <w:sz w:val="22"/>
-          <w:szCs w:val="22"/>
-        </w:rPr>
-        <w:t>Korbinians Ergänzung, in der alten Version gab es den Abschnitt „</w:t>
-      </w:r>
-      <w:r>
-        <w:rPr>
-          <w:b/>
-          <w:bCs/>
-          <w:sz w:val="22"/>
-          <w:szCs w:val="22"/>
-        </w:rPr>
-        <w:t>Soziale Beziehungen</w:t>
-      </w:r>
-      <w:r>
-        <w:rPr>
-          <w:b/>
-          <w:bCs/>
-          <w:sz w:val="22"/>
-          <w:szCs w:val="22"/>
-        </w:rPr>
-        <w:t>“</w:t>
-      </w:r>
-      <w:r>
-        <w:rPr>
-          <w:b/>
-          <w:bCs/>
-          <w:sz w:val="22"/>
-          <w:szCs w:val="22"/>
-        </w:rPr>
-        <w:t xml:space="preserve"> </w:t>
-      </w:r>
-    </w:p>
-    <w:p>
-      <w:pPr>
-        <w:spacing w:line="276" w:lineRule="auto"/>
-        <w:rPr>
-          <w:b/>
-          <w:bCs/>
-          <w:sz w:val="22"/>
-          <w:szCs w:val="22"/>
-        </w:rPr>
-      </w:pPr>
-      <w:r>
-        <w:rPr>
-          <w:b/>
-          <w:bCs/>
-          <w:sz w:val="22"/>
-          <w:szCs w:val="22"/>
-        </w:rPr>
-        <w:t>1) Rollen im Rechtsgeschäft (</w:t>
-      </w:r>
-      <w:proofErr w:type="spellStart"/>
-      <w:r>
-        <w:rPr>
-          <w:b/>
-          <w:bCs/>
-          <w:sz w:val="22"/>
-          <w:szCs w:val="22"/>
-        </w:rPr>
-        <w:t>rs</w:t>
-      </w:r>
-      <w:proofErr w:type="spellEnd"/>
-      <w:r>
-        <w:rPr>
-          <w:b/>
-          <w:bCs/>
-          <w:sz w:val="22"/>
-          <w:szCs w:val="22"/>
-        </w:rPr>
-        <w:t xml:space="preserve"> type="</w:t>
-      </w:r>
-      <w:proofErr w:type="spellStart"/>
-      <w:r>
-        <w:rPr>
-          <w:b/>
-          <w:bCs/>
-          <w:sz w:val="22"/>
-          <w:szCs w:val="22"/>
-        </w:rPr>
-        <w:t>fn</w:t>
-      </w:r>
-      <w:proofErr w:type="spellEnd"/>
-      <w:r>
-        <w:rPr>
-          <w:b/>
-          <w:bCs/>
-          <w:sz w:val="22"/>
-          <w:szCs w:val="22"/>
-        </w:rPr>
-        <w:t xml:space="preserve">" </w:t>
-      </w:r>
-      <w:proofErr w:type="spellStart"/>
-      <w:r>
-        <w:rPr>
-          <w:b/>
-          <w:bCs/>
-          <w:sz w:val="22"/>
-          <w:szCs w:val="22"/>
-        </w:rPr>
-        <w:t>role</w:t>
-      </w:r>
-      <w:proofErr w:type="spellEnd"/>
-      <w:r>
-        <w:rPr>
-          <w:b/>
-          <w:bCs/>
-          <w:sz w:val="22"/>
-          <w:szCs w:val="22"/>
-        </w:rPr>
-        <w:t>="…")</w:t>
-      </w:r>
-    </w:p>
-    <w:p>
-      <w:pPr>
-        <w:spacing w:line="276" w:lineRule="auto"/>
-        <w:rPr>
-          <w:sz w:val="22"/>
-          <w:szCs w:val="22"/>
-        </w:rPr>
-      </w:pPr>
-      <w:r>
-        <w:rPr>
-          <w:sz w:val="22"/>
-          <w:szCs w:val="22"/>
-        </w:rPr>
-        <w:t xml:space="preserve">- </w:t>
-      </w:r>
-      <w:proofErr w:type="spellStart"/>
-      <w:r>
-        <w:rPr>
-          <w:sz w:val="22"/>
-          <w:szCs w:val="22"/>
-        </w:rPr>
-        <w:t>issuer</w:t>
-      </w:r>
-      <w:proofErr w:type="spellEnd"/>
-      <w:r>
-        <w:rPr>
-          <w:sz w:val="22"/>
-          <w:szCs w:val="22"/>
-        </w:rPr>
-        <w:t>: Aussteller/Geber (Person/Organisation, die verfügt oder erklärt).</w:t>
-      </w:r>
-    </w:p>
-    <w:p>
-      <w:pPr>
-        <w:spacing w:line="276" w:lineRule="auto"/>
-        <w:rPr>
-          <w:sz w:val="22"/>
-          <w:szCs w:val="22"/>
-        </w:rPr>
-      </w:pPr>
-      <w:r>
-        <w:rPr>
-          <w:sz w:val="22"/>
-          <w:szCs w:val="22"/>
-        </w:rPr>
-        <w:t xml:space="preserve">- </w:t>
-      </w:r>
-      <w:proofErr w:type="spellStart"/>
-      <w:r>
-        <w:rPr>
-          <w:sz w:val="22"/>
-          <w:szCs w:val="22"/>
-        </w:rPr>
-        <w:t>recipient</w:t>
-      </w:r>
-      <w:proofErr w:type="spellEnd"/>
-      <w:r>
-        <w:rPr>
-          <w:sz w:val="22"/>
-          <w:szCs w:val="22"/>
-        </w:rPr>
-        <w:t>: Empfänger/Adressat (erhält Recht, Gut, Geld).</w:t>
-      </w:r>
-    </w:p>
-    <w:p>
-      <w:pPr>
-        <w:spacing w:line="276" w:lineRule="auto"/>
-        <w:rPr>
-          <w:sz w:val="22"/>
-          <w:szCs w:val="22"/>
-        </w:rPr>
-      </w:pPr>
-      <w:r>
-        <w:rPr>
-          <w:sz w:val="22"/>
-          <w:szCs w:val="22"/>
-        </w:rPr>
-        <w:t xml:space="preserve">- </w:t>
-      </w:r>
-      <w:proofErr w:type="spellStart"/>
-      <w:r>
-        <w:rPr>
-          <w:sz w:val="22"/>
-          <w:szCs w:val="22"/>
-        </w:rPr>
-        <w:t>witness</w:t>
-      </w:r>
-      <w:proofErr w:type="spellEnd"/>
-      <w:r>
-        <w:rPr>
-          <w:sz w:val="22"/>
-          <w:szCs w:val="22"/>
-        </w:rPr>
-        <w:t>: Zeuge/Siegler (bekräftigt, siegelt, „bei/</w:t>
-      </w:r>
-      <w:proofErr w:type="spellStart"/>
-      <w:r>
-        <w:rPr>
-          <w:sz w:val="22"/>
-          <w:szCs w:val="22"/>
-        </w:rPr>
-        <w:t>sigillavit</w:t>
-      </w:r>
-      <w:proofErr w:type="spellEnd"/>
-      <w:r>
-        <w:rPr>
-          <w:sz w:val="22"/>
-          <w:szCs w:val="22"/>
-        </w:rPr>
-        <w:t>“).</w:t>
-      </w:r>
-    </w:p>
-    <w:p>
-      <w:pPr>
-        <w:spacing w:line="276" w:lineRule="auto"/>
-        <w:rPr>
-          <w:sz w:val="22"/>
-          <w:szCs w:val="22"/>
-        </w:rPr>
-      </w:pPr>
-      <w:r>
-        <w:rPr>
-          <w:sz w:val="22"/>
-          <w:szCs w:val="22"/>
-        </w:rPr>
-        <w:t xml:space="preserve">- </w:t>
-      </w:r>
-      <w:proofErr w:type="spellStart"/>
-      <w:r>
-        <w:rPr>
-          <w:sz w:val="22"/>
-          <w:szCs w:val="22"/>
-        </w:rPr>
-        <w:t>other</w:t>
-      </w:r>
-      <w:proofErr w:type="spellEnd"/>
-      <w:r>
-        <w:rPr>
-          <w:sz w:val="22"/>
-          <w:szCs w:val="22"/>
-        </w:rPr>
-        <w:t xml:space="preserve">: weitere Beteiligte/Funktionen (z. B. Grundherrin/-herr „mit </w:t>
-      </w:r>
-      <w:proofErr w:type="spellStart"/>
-      <w:r>
-        <w:rPr>
-          <w:sz w:val="22"/>
-          <w:szCs w:val="22"/>
-        </w:rPr>
-        <w:t>Handen</w:t>
-      </w:r>
-      <w:proofErr w:type="spellEnd"/>
-      <w:r>
-        <w:rPr>
-          <w:sz w:val="22"/>
-          <w:szCs w:val="22"/>
-        </w:rPr>
-        <w:t>“, Ratgeber, Intervenient). Spezifikation der Funktion via &lt;</w:t>
-      </w:r>
-      <w:proofErr w:type="spellStart"/>
-      <w:r>
-        <w:rPr>
-          <w:sz w:val="22"/>
-          <w:szCs w:val="22"/>
-        </w:rPr>
-        <w:t>triggerstring</w:t>
-      </w:r>
-      <w:proofErr w:type="spellEnd"/>
-      <w:r>
-        <w:rPr>
-          <w:sz w:val="22"/>
-          <w:szCs w:val="22"/>
-        </w:rPr>
-        <w:t xml:space="preserve"> n="</w:t>
-      </w:r>
-      <w:proofErr w:type="spellStart"/>
-      <w:r>
-        <w:rPr>
-          <w:sz w:val="22"/>
-          <w:szCs w:val="22"/>
-        </w:rPr>
-        <w:t>fn</w:t>
-      </w:r>
-      <w:proofErr w:type="spellEnd"/>
-      <w:r>
-        <w:rPr>
-          <w:sz w:val="22"/>
-          <w:szCs w:val="22"/>
-        </w:rPr>
-        <w:t>"&gt;.</w:t>
-      </w:r>
-    </w:p>
-    <w:p>
-      <w:pPr>
-        <w:spacing w:line="276" w:lineRule="auto"/>
-        <w:rPr>
-          <w:sz w:val="22"/>
-          <w:szCs w:val="22"/>
-        </w:rPr>
-      </w:pPr>
-    </w:p>
-    <w:p>
-      <w:pPr>
-        <w:spacing w:line="276" w:lineRule="auto"/>
-        <w:rPr>
-          <w:b/>
-          <w:bCs/>
-          <w:sz w:val="22"/>
-          <w:szCs w:val="22"/>
-        </w:rPr>
-      </w:pPr>
-      <w:r>
-        <w:rPr>
-          <w:b/>
-          <w:bCs/>
-          <w:sz w:val="22"/>
-          <w:szCs w:val="22"/>
-        </w:rPr>
-        <w:t>2) Dispositive Verben (</w:t>
-      </w:r>
-      <w:proofErr w:type="spellStart"/>
-      <w:r>
-        <w:rPr>
-          <w:b/>
-          <w:bCs/>
-          <w:sz w:val="22"/>
-          <w:szCs w:val="22"/>
-        </w:rPr>
-        <w:t>triggerstring</w:t>
-      </w:r>
-      <w:proofErr w:type="spellEnd"/>
-      <w:r>
-        <w:rPr>
-          <w:b/>
-          <w:bCs/>
-          <w:sz w:val="22"/>
-          <w:szCs w:val="22"/>
-        </w:rPr>
-        <w:t xml:space="preserve"> n="</w:t>
-      </w:r>
-      <w:proofErr w:type="spellStart"/>
-      <w:r>
-        <w:rPr>
-          <w:b/>
-          <w:bCs/>
-          <w:sz w:val="22"/>
-          <w:szCs w:val="22"/>
-        </w:rPr>
-        <w:t>disp</w:t>
-      </w:r>
-      <w:proofErr w:type="spellEnd"/>
-      <w:r>
-        <w:rPr>
-          <w:b/>
-          <w:bCs/>
-          <w:sz w:val="22"/>
-          <w:szCs w:val="22"/>
-        </w:rPr>
-        <w:t>")</w:t>
-      </w:r>
-    </w:p>
-    <w:p>
-      <w:pPr>
-        <w:spacing w:line="276" w:lineRule="auto"/>
-        <w:rPr>
-          <w:sz w:val="22"/>
-          <w:szCs w:val="22"/>
-        </w:rPr>
-      </w:pPr>
-      <w:r>
-        <w:rPr>
-          <w:sz w:val="22"/>
-          <w:szCs w:val="22"/>
-        </w:rPr>
-        <w:t>Zentrale Aktionswörter, die das Event typisieren (Beispiele inkl. typischer Formulierungen):</w:t>
-      </w:r>
-    </w:p>
-    <w:p>
-      <w:pPr>
-        <w:spacing w:line="276" w:lineRule="auto"/>
-        <w:rPr>
-          <w:sz w:val="22"/>
-          <w:szCs w:val="22"/>
-        </w:rPr>
-      </w:pPr>
-      <w:r>
-        <w:rPr>
-          <w:sz w:val="22"/>
-          <w:szCs w:val="22"/>
-        </w:rPr>
-        <w:t xml:space="preserve">- Kauf/Verkauf: verkaufen, erkaufen, verhandeln; </w:t>
-      </w:r>
-      <w:proofErr w:type="spellStart"/>
-      <w:r>
-        <w:rPr>
-          <w:sz w:val="22"/>
-          <w:szCs w:val="22"/>
-        </w:rPr>
-        <w:t>habent</w:t>
-      </w:r>
-      <w:proofErr w:type="spellEnd"/>
-      <w:r>
-        <w:rPr>
-          <w:sz w:val="22"/>
-          <w:szCs w:val="22"/>
-        </w:rPr>
-        <w:t xml:space="preserve"> </w:t>
-      </w:r>
-      <w:proofErr w:type="spellStart"/>
-      <w:r>
-        <w:rPr>
-          <w:sz w:val="22"/>
-          <w:szCs w:val="22"/>
-        </w:rPr>
-        <w:t>verkaufft</w:t>
-      </w:r>
-      <w:proofErr w:type="spellEnd"/>
-      <w:r>
-        <w:rPr>
-          <w:sz w:val="22"/>
-          <w:szCs w:val="22"/>
-        </w:rPr>
-        <w:t xml:space="preserve">; gelts </w:t>
-      </w:r>
-      <w:proofErr w:type="spellStart"/>
-      <w:r>
-        <w:rPr>
-          <w:sz w:val="22"/>
-          <w:szCs w:val="22"/>
-        </w:rPr>
-        <w:t>purkrechts</w:t>
-      </w:r>
-      <w:proofErr w:type="spellEnd"/>
-      <w:r>
-        <w:rPr>
-          <w:sz w:val="22"/>
-          <w:szCs w:val="22"/>
-        </w:rPr>
-        <w:t xml:space="preserve"> (Burgrechtskauf).</w:t>
-      </w:r>
-    </w:p>
-    <w:p>
-      <w:pPr>
-        <w:spacing w:line="276" w:lineRule="auto"/>
-        <w:rPr>
-          <w:sz w:val="22"/>
-          <w:szCs w:val="22"/>
-        </w:rPr>
-      </w:pPr>
-      <w:r>
-        <w:rPr>
-          <w:sz w:val="22"/>
-          <w:szCs w:val="22"/>
-        </w:rPr>
-        <w:t>- Schenkung/Stiftung/Widmung: schenken, stiften, widmen.</w:t>
-      </w:r>
-    </w:p>
-    <w:p>
-      <w:pPr>
-        <w:spacing w:line="276" w:lineRule="auto"/>
-        <w:rPr>
-          <w:sz w:val="22"/>
-          <w:szCs w:val="22"/>
-        </w:rPr>
-      </w:pPr>
-      <w:r>
-        <w:rPr>
-          <w:sz w:val="22"/>
-          <w:szCs w:val="22"/>
-        </w:rPr>
-        <w:t>- Übergabe/Übertragung: übergeben, übertragen, einantworten, auflassen.</w:t>
-      </w:r>
-    </w:p>
-    <w:p>
-      <w:pPr>
-        <w:spacing w:line="276" w:lineRule="auto"/>
-        <w:rPr>
-          <w:sz w:val="22"/>
-          <w:szCs w:val="22"/>
-        </w:rPr>
-      </w:pPr>
-      <w:r>
-        <w:rPr>
-          <w:sz w:val="22"/>
-          <w:szCs w:val="22"/>
-        </w:rPr>
-        <w:t>- Verpfändung/Sicherung: verpfänden, versetzen, verpflichten.</w:t>
-      </w:r>
-    </w:p>
-    <w:p>
-      <w:pPr>
-        <w:spacing w:line="276" w:lineRule="auto"/>
-        <w:rPr>
-          <w:sz w:val="22"/>
-          <w:szCs w:val="22"/>
-        </w:rPr>
-      </w:pPr>
-      <w:r>
-        <w:rPr>
-          <w:sz w:val="22"/>
-          <w:szCs w:val="22"/>
-        </w:rPr>
-        <w:t>- Darlehen/Kredit/Zins: leihen, aufnehmen, verzinsen, quittieren.</w:t>
-      </w:r>
-    </w:p>
-    <w:p>
-      <w:pPr>
-        <w:spacing w:line="276" w:lineRule="auto"/>
-        <w:rPr>
-          <w:sz w:val="22"/>
-          <w:szCs w:val="22"/>
-        </w:rPr>
-      </w:pPr>
-      <w:r>
-        <w:rPr>
-          <w:sz w:val="22"/>
-          <w:szCs w:val="22"/>
-        </w:rPr>
-        <w:t>- Bestätigung/Beglaubigung: bestätigen, beurkunden, vidimieren.</w:t>
-      </w:r>
-    </w:p>
-    <w:p>
-      <w:pPr>
-        <w:spacing w:line="276" w:lineRule="auto"/>
-        <w:rPr>
-          <w:sz w:val="22"/>
-          <w:szCs w:val="22"/>
-        </w:rPr>
-      </w:pPr>
-      <w:r>
-        <w:rPr>
-          <w:sz w:val="22"/>
-          <w:szCs w:val="22"/>
-        </w:rPr>
-        <w:t>- Gericht/Verfahren: klagen, antworten, vergleichen, sprechen/zusprechen, verurteilen.</w:t>
-      </w:r>
-    </w:p>
-    <w:p>
-      <w:pPr>
-        <w:spacing w:line="276" w:lineRule="auto"/>
-        <w:rPr>
-          <w:sz w:val="22"/>
-          <w:szCs w:val="22"/>
-        </w:rPr>
-      </w:pPr>
-      <w:r>
-        <w:rPr>
-          <w:sz w:val="22"/>
-          <w:szCs w:val="22"/>
-        </w:rPr>
-        <w:t>- Bestellung/Einsetzung: setzen, bestellen, einsetzen (Amt/Vertretung).</w:t>
-      </w:r>
-    </w:p>
-    <w:p>
-      <w:pPr>
-        <w:spacing w:line="276" w:lineRule="auto"/>
-        <w:rPr>
-          <w:sz w:val="22"/>
-          <w:szCs w:val="22"/>
-        </w:rPr>
-      </w:pPr>
-      <w:r>
-        <w:rPr>
-          <w:sz w:val="22"/>
-          <w:szCs w:val="22"/>
-        </w:rPr>
-        <w:t>- Nutzung/Miete/Pacht: mieten, pachten, verleihen (Nutzungsrechte).</w:t>
-      </w:r>
-    </w:p>
-    <w:p>
-      <w:pPr>
-        <w:spacing w:line="276" w:lineRule="auto"/>
-        <w:rPr>
-          <w:sz w:val="22"/>
-          <w:szCs w:val="22"/>
-        </w:rPr>
-      </w:pPr>
-      <w:r>
-        <w:rPr>
-          <w:sz w:val="22"/>
-          <w:szCs w:val="22"/>
-        </w:rPr>
-        <w:t>- Lösen/Ablösen: lösen, ablösen, auslösen.</w:t>
-      </w:r>
-    </w:p>
-    <w:p>
-      <w:pPr>
-        <w:spacing w:line="276" w:lineRule="auto"/>
-        <w:rPr>
-          <w:b/>
-          <w:bCs/>
-          <w:sz w:val="22"/>
-          <w:szCs w:val="22"/>
-          <w:lang w:val="en-GB"/>
-        </w:rPr>
-      </w:pPr>
-      <w:r>
-        <w:rPr>
-          <w:b/>
-          <w:bCs/>
-          <w:sz w:val="22"/>
-          <w:szCs w:val="22"/>
-          <w:lang w:val="en-GB"/>
-        </w:rPr>
-        <w:t xml:space="preserve">3) </w:t>
-      </w:r>
-      <w:proofErr w:type="spellStart"/>
-      <w:r>
-        <w:rPr>
-          <w:b/>
-          <w:bCs/>
-          <w:sz w:val="22"/>
-          <w:szCs w:val="22"/>
-          <w:lang w:val="en-GB"/>
-        </w:rPr>
-        <w:t>roleName</w:t>
-      </w:r>
-      <w:proofErr w:type="spellEnd"/>
-      <w:r>
-        <w:rPr>
-          <w:b/>
-          <w:bCs/>
-          <w:sz w:val="22"/>
-          <w:szCs w:val="22"/>
-          <w:lang w:val="en-GB"/>
-        </w:rPr>
-        <w:t xml:space="preserve">-Typen: Attribute und </w:t>
-      </w:r>
-      <w:proofErr w:type="spellStart"/>
-      <w:r>
-        <w:rPr>
-          <w:b/>
-          <w:bCs/>
-          <w:sz w:val="22"/>
-          <w:szCs w:val="22"/>
-          <w:lang w:val="en-GB"/>
-        </w:rPr>
-        <w:t>Relationen</w:t>
-      </w:r>
-      <w:proofErr w:type="spellEnd"/>
-    </w:p>
-    <w:p>
-      <w:pPr>
-        <w:spacing w:line="276" w:lineRule="auto"/>
-        <w:rPr>
-          <w:sz w:val="22"/>
-          <w:szCs w:val="22"/>
-          <w:lang w:val="en-GB"/>
-        </w:rPr>
-      </w:pPr>
-      <w:r>
-        <w:rPr>
-          <w:sz w:val="22"/>
-          <w:szCs w:val="22"/>
-          <w:lang w:val="en-GB"/>
-        </w:rPr>
-        <w:t>A) Attribute (</w:t>
-      </w:r>
-      <w:proofErr w:type="spellStart"/>
-      <w:r>
-        <w:rPr>
-          <w:sz w:val="22"/>
-          <w:szCs w:val="22"/>
-          <w:lang w:val="en-GB"/>
-        </w:rPr>
-        <w:t>roleName</w:t>
-      </w:r>
-      <w:proofErr w:type="spellEnd"/>
-      <w:r>
-        <w:rPr>
-          <w:sz w:val="22"/>
-          <w:szCs w:val="22"/>
-          <w:lang w:val="en-GB"/>
-        </w:rPr>
-        <w:t xml:space="preserve"> </w:t>
-      </w:r>
-      <w:proofErr w:type="spellStart"/>
-      <w:r>
-        <w:rPr>
-          <w:sz w:val="22"/>
-          <w:szCs w:val="22"/>
-          <w:lang w:val="en-GB"/>
-        </w:rPr>
-        <w:t>ohne</w:t>
-      </w:r>
-      <w:proofErr w:type="spellEnd"/>
-      <w:r>
-        <w:rPr>
-          <w:sz w:val="22"/>
-          <w:szCs w:val="22"/>
-          <w:lang w:val="en-GB"/>
-        </w:rPr>
-        <w:t xml:space="preserve"> </w:t>
-      </w:r>
-      <w:proofErr w:type="spellStart"/>
-      <w:r>
-        <w:rPr>
-          <w:sz w:val="22"/>
-          <w:szCs w:val="22"/>
-          <w:lang w:val="en-GB"/>
-        </w:rPr>
-        <w:t>Relationen</w:t>
-      </w:r>
-      <w:proofErr w:type="spellEnd"/>
-      <w:r>
-        <w:rPr>
-          <w:sz w:val="22"/>
-          <w:szCs w:val="22"/>
-          <w:lang w:val="en-GB"/>
-        </w:rPr>
-        <w:t xml:space="preserve"> = </w:t>
-      </w:r>
-      <w:proofErr w:type="spellStart"/>
-      <w:r>
-        <w:rPr>
-          <w:sz w:val="22"/>
-          <w:szCs w:val="22"/>
-          <w:lang w:val="en-GB"/>
-        </w:rPr>
-        <w:t>corresp</w:t>
-      </w:r>
-      <w:proofErr w:type="spellEnd"/>
-      <w:r>
-        <w:rPr>
-          <w:sz w:val="22"/>
-          <w:szCs w:val="22"/>
-          <w:lang w:val="en-GB"/>
-        </w:rPr>
-        <w:t>)</w:t>
-      </w:r>
-    </w:p>
-    <w:p>
-      <w:pPr>
-        <w:spacing w:line="276" w:lineRule="auto"/>
-        <w:rPr>
-          <w:sz w:val="22"/>
-          <w:szCs w:val="22"/>
-        </w:rPr>
-      </w:pPr>
-      <w:r>
-        <w:rPr>
-          <w:sz w:val="22"/>
-          <w:szCs w:val="22"/>
-        </w:rPr>
-        <w:t>- type="</w:t>
-      </w:r>
-      <w:proofErr w:type="spellStart"/>
-      <w:r>
-        <w:rPr>
-          <w:sz w:val="22"/>
-          <w:szCs w:val="22"/>
-        </w:rPr>
-        <w:t>prof</w:t>
-      </w:r>
-      <w:proofErr w:type="spellEnd"/>
-      <w:r>
-        <w:rPr>
-          <w:sz w:val="22"/>
-          <w:szCs w:val="22"/>
-        </w:rPr>
-        <w:t>": Beruf (Ausbi</w:t>
-      </w:r>
-      <w:r>
-        <w:rPr>
-          <w:sz w:val="22"/>
-          <w:szCs w:val="22"/>
-        </w:rPr>
-        <w:t>ld</w:t>
-      </w:r>
-      <w:r>
-        <w:rPr>
-          <w:sz w:val="22"/>
-          <w:szCs w:val="22"/>
-        </w:rPr>
-        <w:t>ung, z. B. „</w:t>
-      </w:r>
-      <w:proofErr w:type="spellStart"/>
-      <w:r>
-        <w:rPr>
-          <w:sz w:val="22"/>
-          <w:szCs w:val="22"/>
-        </w:rPr>
-        <w:t>maurer</w:t>
-      </w:r>
-      <w:proofErr w:type="spellEnd"/>
-      <w:r>
-        <w:rPr>
-          <w:sz w:val="22"/>
-          <w:szCs w:val="22"/>
-        </w:rPr>
-        <w:t>“, „</w:t>
-      </w:r>
-      <w:proofErr w:type="spellStart"/>
-      <w:r>
-        <w:rPr>
-          <w:sz w:val="22"/>
-          <w:szCs w:val="22"/>
-        </w:rPr>
-        <w:t>schneider</w:t>
-      </w:r>
-      <w:proofErr w:type="spellEnd"/>
-      <w:r>
-        <w:rPr>
-          <w:sz w:val="22"/>
-          <w:szCs w:val="22"/>
-        </w:rPr>
-        <w:t>“).</w:t>
-      </w:r>
-    </w:p>
-    <w:p>
-      <w:pPr>
-        <w:spacing w:line="276" w:lineRule="auto"/>
-        <w:rPr>
-          <w:sz w:val="22"/>
-          <w:szCs w:val="22"/>
-          <w:lang w:val="en-GB"/>
-        </w:rPr>
-      </w:pPr>
-      <w:r>
-        <w:rPr>
-          <w:sz w:val="22"/>
-          <w:szCs w:val="22"/>
-          <w:lang w:val="en-GB"/>
-        </w:rPr>
-        <w:t>- type="title": Titel/Rang (z. B. „</w:t>
-      </w:r>
-      <w:proofErr w:type="gramStart"/>
-      <w:r>
-        <w:rPr>
-          <w:sz w:val="22"/>
-          <w:szCs w:val="22"/>
-          <w:lang w:val="en-GB"/>
-        </w:rPr>
-        <w:t>her“</w:t>
-      </w:r>
-      <w:proofErr w:type="gramEnd"/>
-      <w:r>
-        <w:rPr>
-          <w:sz w:val="22"/>
-          <w:szCs w:val="22"/>
-          <w:lang w:val="en-GB"/>
-        </w:rPr>
-        <w:t>, „</w:t>
-      </w:r>
-      <w:proofErr w:type="gramStart"/>
-      <w:r>
-        <w:rPr>
-          <w:sz w:val="22"/>
-          <w:szCs w:val="22"/>
-          <w:lang w:val="en-GB"/>
-        </w:rPr>
-        <w:t>magister“</w:t>
-      </w:r>
-      <w:proofErr w:type="gramEnd"/>
-      <w:r>
-        <w:rPr>
-          <w:sz w:val="22"/>
-          <w:szCs w:val="22"/>
-          <w:lang w:val="en-GB"/>
-        </w:rPr>
-        <w:t>).</w:t>
-      </w:r>
-    </w:p>
-    <w:p>
-      <w:pPr>
-        <w:spacing w:line="276" w:lineRule="auto"/>
-        <w:rPr>
-          <w:sz w:val="22"/>
-          <w:szCs w:val="22"/>
-        </w:rPr>
-      </w:pPr>
-      <w:r>
-        <w:rPr>
-          <w:sz w:val="22"/>
-          <w:szCs w:val="22"/>
-        </w:rPr>
-        <w:t>- type="</w:t>
-      </w:r>
-      <w:proofErr w:type="spellStart"/>
-      <w:r>
-        <w:rPr>
-          <w:sz w:val="22"/>
-          <w:szCs w:val="22"/>
-        </w:rPr>
-        <w:t>dead</w:t>
-      </w:r>
-      <w:proofErr w:type="spellEnd"/>
-      <w:r>
-        <w:rPr>
-          <w:sz w:val="22"/>
-          <w:szCs w:val="22"/>
-        </w:rPr>
-        <w:t>": Todesfloskel/Status („selig“, „</w:t>
-      </w:r>
-      <w:proofErr w:type="spellStart"/>
-      <w:r>
-        <w:rPr>
-          <w:sz w:val="22"/>
-          <w:szCs w:val="22"/>
-        </w:rPr>
-        <w:t>weilent</w:t>
-      </w:r>
-      <w:proofErr w:type="spellEnd"/>
-      <w:r>
-        <w:rPr>
-          <w:sz w:val="22"/>
-          <w:szCs w:val="22"/>
-        </w:rPr>
-        <w:t>“).</w:t>
-      </w:r>
-    </w:p>
-    <w:p>
-      <w:pPr>
-        <w:spacing w:line="276" w:lineRule="auto"/>
-        <w:rPr>
-          <w:sz w:val="22"/>
-          <w:szCs w:val="22"/>
-        </w:rPr>
-      </w:pPr>
-      <w:r>
-        <w:rPr>
-          <w:sz w:val="22"/>
-          <w:szCs w:val="22"/>
-        </w:rPr>
-        <w:t>B) Relationen (</w:t>
-      </w:r>
-      <w:proofErr w:type="spellStart"/>
-      <w:r>
-        <w:rPr>
-          <w:sz w:val="22"/>
-          <w:szCs w:val="22"/>
-        </w:rPr>
-        <w:t>roleName</w:t>
-      </w:r>
-      <w:proofErr w:type="spellEnd"/>
-      <w:r>
-        <w:rPr>
-          <w:sz w:val="22"/>
-          <w:szCs w:val="22"/>
-        </w:rPr>
-        <w:t xml:space="preserve"> mit Relationen = </w:t>
-      </w:r>
-      <w:proofErr w:type="spellStart"/>
-      <w:r>
-        <w:rPr>
-          <w:sz w:val="22"/>
-          <w:szCs w:val="22"/>
-        </w:rPr>
-        <w:t>corresp</w:t>
-      </w:r>
-      <w:proofErr w:type="spellEnd"/>
-      <w:r>
-        <w:rPr>
-          <w:sz w:val="22"/>
-          <w:szCs w:val="22"/>
-        </w:rPr>
-        <w:t>)</w:t>
-      </w:r>
-    </w:p>
-    <w:p>
-      <w:pPr>
-        <w:spacing w:line="276" w:lineRule="auto"/>
-        <w:rPr>
-          <w:sz w:val="22"/>
-          <w:szCs w:val="22"/>
-        </w:rPr>
-      </w:pPr>
-      <w:r>
-        <w:rPr>
-          <w:sz w:val="22"/>
-          <w:szCs w:val="22"/>
-        </w:rPr>
-        <w:t>- type="</w:t>
-      </w:r>
-      <w:proofErr w:type="spellStart"/>
-      <w:r>
-        <w:rPr>
-          <w:sz w:val="22"/>
-          <w:szCs w:val="22"/>
-        </w:rPr>
-        <w:t>kin</w:t>
-      </w:r>
-      <w:proofErr w:type="spellEnd"/>
-      <w:r>
-        <w:rPr>
-          <w:sz w:val="22"/>
-          <w:szCs w:val="22"/>
-        </w:rPr>
-        <w:t>": Verwandtschaft (z. B. „</w:t>
-      </w:r>
-      <w:proofErr w:type="spellStart"/>
-      <w:r>
-        <w:rPr>
-          <w:sz w:val="22"/>
-          <w:szCs w:val="22"/>
-        </w:rPr>
-        <w:t>witib</w:t>
-      </w:r>
-      <w:proofErr w:type="spellEnd"/>
-      <w:r>
-        <w:rPr>
-          <w:sz w:val="22"/>
-          <w:szCs w:val="22"/>
-        </w:rPr>
-        <w:t>“, „</w:t>
-      </w:r>
-      <w:proofErr w:type="spellStart"/>
-      <w:r>
-        <w:rPr>
-          <w:sz w:val="22"/>
-          <w:szCs w:val="22"/>
-        </w:rPr>
-        <w:t>sohn</w:t>
-      </w:r>
-      <w:proofErr w:type="spellEnd"/>
-      <w:r>
-        <w:rPr>
-          <w:sz w:val="22"/>
-          <w:szCs w:val="22"/>
-        </w:rPr>
-        <w:t>“, „</w:t>
-      </w:r>
-      <w:proofErr w:type="spellStart"/>
-      <w:r>
-        <w:rPr>
-          <w:sz w:val="22"/>
-          <w:szCs w:val="22"/>
-        </w:rPr>
-        <w:t>swager</w:t>
-      </w:r>
-      <w:proofErr w:type="spellEnd"/>
-      <w:r>
-        <w:rPr>
-          <w:sz w:val="22"/>
-          <w:szCs w:val="22"/>
-        </w:rPr>
-        <w:t>“).</w:t>
-      </w:r>
-    </w:p>
-    <w:p>
-      <w:pPr>
-        <w:spacing w:line="276" w:lineRule="auto"/>
-        <w:rPr>
-          <w:sz w:val="22"/>
-          <w:szCs w:val="22"/>
-        </w:rPr>
-      </w:pPr>
-      <w:r>
-        <w:rPr>
-          <w:sz w:val="22"/>
-          <w:szCs w:val="22"/>
-        </w:rPr>
-        <w:t>- type="</w:t>
-      </w:r>
-      <w:proofErr w:type="spellStart"/>
-      <w:r>
-        <w:rPr>
-          <w:sz w:val="22"/>
-          <w:szCs w:val="22"/>
-        </w:rPr>
-        <w:t>rep</w:t>
-      </w:r>
-      <w:proofErr w:type="spellEnd"/>
-      <w:r>
-        <w:rPr>
-          <w:sz w:val="22"/>
-          <w:szCs w:val="22"/>
-        </w:rPr>
-        <w:t>": Rechtliche Vertretung/Prokuration (z.B. „</w:t>
-      </w:r>
-      <w:proofErr w:type="spellStart"/>
-      <w:r>
-        <w:rPr>
-          <w:sz w:val="22"/>
-          <w:szCs w:val="22"/>
-        </w:rPr>
-        <w:t>Gerhaben</w:t>
-      </w:r>
-      <w:proofErr w:type="spellEnd"/>
-      <w:r>
-        <w:rPr>
-          <w:sz w:val="22"/>
-          <w:szCs w:val="22"/>
-        </w:rPr>
-        <w:t>“)</w:t>
-      </w:r>
-    </w:p>
-    <w:p>
-      <w:pPr>
-        <w:spacing w:line="276" w:lineRule="auto"/>
-        <w:rPr>
-          <w:sz w:val="22"/>
-          <w:szCs w:val="22"/>
-        </w:rPr>
-      </w:pPr>
-      <w:r>
-        <w:rPr>
-          <w:sz w:val="22"/>
-          <w:szCs w:val="22"/>
-        </w:rPr>
-        <w:t>- type="</w:t>
-      </w:r>
-      <w:proofErr w:type="spellStart"/>
-      <w:r>
-        <w:rPr>
-          <w:sz w:val="22"/>
-          <w:szCs w:val="22"/>
-        </w:rPr>
-        <w:t>occ</w:t>
-      </w:r>
-      <w:proofErr w:type="spellEnd"/>
-      <w:r>
-        <w:rPr>
-          <w:sz w:val="22"/>
-          <w:szCs w:val="22"/>
-        </w:rPr>
-        <w:t>": Tätigkeitsbeziehung (z.B. Amtsträger zu Amt/Institution; Dienstverhältnis).</w:t>
-      </w:r>
-    </w:p>
-    <w:p>
-      <w:pPr>
-        <w:spacing w:line="276" w:lineRule="auto"/>
-        <w:rPr>
-          <w:sz w:val="22"/>
-          <w:szCs w:val="22"/>
-        </w:rPr>
-      </w:pPr>
-      <w:r>
-        <w:rPr>
-          <w:sz w:val="22"/>
-          <w:szCs w:val="22"/>
-        </w:rPr>
-        <w:t>- type="</w:t>
-      </w:r>
-      <w:proofErr w:type="spellStart"/>
-      <w:r>
-        <w:rPr>
-          <w:sz w:val="22"/>
-          <w:szCs w:val="22"/>
-        </w:rPr>
-        <w:t>title_ref</w:t>
-      </w:r>
-      <w:proofErr w:type="spellEnd"/>
-      <w:r>
-        <w:rPr>
-          <w:sz w:val="22"/>
-          <w:szCs w:val="22"/>
-        </w:rPr>
-        <w:t>": Titulare Bindung an Ort (z.B. „von“)</w:t>
-      </w:r>
-    </w:p>
-    <w:p>
-      <w:pPr>
-        <w:rPr>
-          <w:b/>
-          <w:bCs/>
-          <w:sz w:val="22"/>
-          <w:szCs w:val="22"/>
-        </w:rPr>
-      </w:pPr>
-      <w:r>
-        <w:rPr>
-          <w:b/>
-          <w:bCs/>
-          <w:sz w:val="22"/>
-          <w:szCs w:val="22"/>
-        </w:rPr>
-        <w:lastRenderedPageBreak/>
-        <w:t>I</w:t>
-      </w:r>
-      <w:r>
-        <w:rPr>
-          <w:b/>
-          <w:bCs/>
-          <w:sz w:val="22"/>
-          <w:szCs w:val="22"/>
-        </w:rPr>
-        <w:t xml:space="preserve">) </w:t>
-      </w:r>
-      <w:r>
-        <w:rPr>
-          <w:b/>
-          <w:bCs/>
-          <w:sz w:val="22"/>
-          <w:szCs w:val="22"/>
-        </w:rPr>
-        <w:t xml:space="preserve">Fallbeispiele: </w:t>
-      </w:r>
-    </w:p>
-    <w:p>
-      <w:r>
-        <w:rPr>
-          <w:b/>
-          <w:sz w:val="22"/>
-        </w:rPr>
-        <w:t>Fallbeispiel 1</w:t>
-      </w:r>
-      <w:r>
-        <w:rPr>
-          <w:b/>
-          <w:sz w:val="22"/>
-        </w:rPr>
-        <w:t xml:space="preserve">: </w:t>
-      </w:r>
-      <w:r>
-        <w:rPr>
-          <w:b/>
-          <w:sz w:val="22"/>
-        </w:rPr>
-        <w:t xml:space="preserve">Verkauf „mit </w:t>
-      </w:r>
-      <w:proofErr w:type="spellStart"/>
-      <w:r>
-        <w:rPr>
-          <w:b/>
-          <w:sz w:val="22"/>
-        </w:rPr>
-        <w:t>Handen</w:t>
-      </w:r>
-      <w:proofErr w:type="spellEnd"/>
-      <w:r>
-        <w:rPr>
-          <w:b/>
-          <w:sz w:val="22"/>
-        </w:rPr>
-        <w:t>“ der Stadt (</w:t>
-      </w:r>
-      <w:r>
-        <w:rPr>
-          <w:b/>
-          <w:sz w:val="22"/>
-        </w:rPr>
-        <w:t>Nr.</w:t>
-      </w:r>
-      <w:r>
-        <w:rPr>
-          <w:b/>
-          <w:sz w:val="22"/>
-        </w:rPr>
-        <w:t xml:space="preserve"> 604</w:t>
-      </w:r>
-      <w:r>
-        <w:rPr>
-          <w:b/>
-          <w:sz w:val="22"/>
-        </w:rPr>
-        <w:t>)</w:t>
-      </w:r>
-    </w:p>
-    <w:p>
-      <w:r>
-        <w:rPr>
-          <w:sz w:val="22"/>
-        </w:rPr>
-        <w:t xml:space="preserve">Link zum Frontend: </w:t>
-      </w:r>
-      <w:hyperlink r:id="rId26" w:history="1">
-        <w:r>
-          <w:rPr>
-            <w:rStyle w:val="Hyperlink"/>
-            <w:sz w:val="22"/>
-          </w:rPr>
-          <w:t>https://chpollin.github.io/db_for_medieval_legal_transactions_edition/documents/QGW/Vienna_1177-1414_ready/604.html</w:t>
-        </w:r>
-      </w:hyperlink>
-      <w:r>
-        <w:rPr>
-          <w:sz w:val="22"/>
-        </w:rPr>
-        <w:t xml:space="preserve"> </w:t>
-      </w:r>
-    </w:p>
-    <w:p>
-      <w:pPr>
-        <w:rPr>
-          <w:sz w:val="22"/>
-        </w:rPr>
-      </w:pPr>
-      <w:r>
-        <w:rPr>
-          <w:sz w:val="22"/>
-        </w:rPr>
-        <w:t xml:space="preserve">„Hainreich der </w:t>
-      </w:r>
-      <w:proofErr w:type="spellStart"/>
-      <w:r>
-        <w:rPr>
-          <w:sz w:val="22"/>
-        </w:rPr>
-        <w:t>Santwerfer</w:t>
-      </w:r>
-      <w:proofErr w:type="spellEnd"/>
-      <w:r>
-        <w:rPr>
-          <w:sz w:val="22"/>
-        </w:rPr>
-        <w:t xml:space="preserve"> und Elsbet, seine Hausfrau, verkaufen mit </w:t>
-      </w:r>
-      <w:proofErr w:type="spellStart"/>
-      <w:r>
-        <w:rPr>
-          <w:sz w:val="22"/>
-        </w:rPr>
-        <w:t>Handen</w:t>
-      </w:r>
-      <w:proofErr w:type="spellEnd"/>
-      <w:r>
-        <w:rPr>
-          <w:sz w:val="22"/>
-        </w:rPr>
-        <w:t xml:space="preserve"> </w:t>
-      </w:r>
-      <w:proofErr w:type="spellStart"/>
-      <w:r>
-        <w:rPr>
-          <w:sz w:val="22"/>
-        </w:rPr>
-        <w:t>hern</w:t>
-      </w:r>
-      <w:proofErr w:type="spellEnd"/>
-      <w:r>
-        <w:rPr>
-          <w:sz w:val="22"/>
-        </w:rPr>
-        <w:t xml:space="preserve"> Jansen von </w:t>
-      </w:r>
-      <w:proofErr w:type="spellStart"/>
-      <w:r>
-        <w:rPr>
-          <w:sz w:val="22"/>
-        </w:rPr>
-        <w:t>Tirnach</w:t>
-      </w:r>
-      <w:proofErr w:type="spellEnd"/>
-      <w:r>
-        <w:rPr>
-          <w:sz w:val="22"/>
-        </w:rPr>
-        <w:t xml:space="preserve">, </w:t>
-      </w:r>
-      <w:proofErr w:type="spellStart"/>
-      <w:r>
-        <w:rPr>
-          <w:sz w:val="22"/>
-        </w:rPr>
-        <w:t>purgermaister</w:t>
-      </w:r>
-      <w:proofErr w:type="spellEnd"/>
-      <w:r>
-        <w:rPr>
-          <w:sz w:val="22"/>
-        </w:rPr>
-        <w:t xml:space="preserve"> und </w:t>
-      </w:r>
-      <w:proofErr w:type="spellStart"/>
-      <w:r>
-        <w:rPr>
-          <w:sz w:val="22"/>
-        </w:rPr>
-        <w:t>munsmaister</w:t>
-      </w:r>
-      <w:proofErr w:type="spellEnd"/>
-      <w:r>
-        <w:rPr>
-          <w:sz w:val="22"/>
-        </w:rPr>
-        <w:t xml:space="preserve">, und des </w:t>
-      </w:r>
-      <w:proofErr w:type="spellStart"/>
-      <w:r>
-        <w:rPr>
-          <w:sz w:val="22"/>
-        </w:rPr>
-        <w:t>rates</w:t>
-      </w:r>
-      <w:proofErr w:type="spellEnd"/>
-      <w:r>
-        <w:rPr>
-          <w:sz w:val="22"/>
-        </w:rPr>
-        <w:t xml:space="preserve"> </w:t>
-      </w:r>
-      <w:proofErr w:type="spellStart"/>
-      <w:r>
-        <w:rPr>
-          <w:sz w:val="22"/>
-        </w:rPr>
-        <w:t>gemain</w:t>
-      </w:r>
-      <w:proofErr w:type="spellEnd"/>
-      <w:r>
-        <w:rPr>
-          <w:sz w:val="22"/>
-        </w:rPr>
-        <w:t xml:space="preserve"> der </w:t>
-      </w:r>
-      <w:proofErr w:type="spellStart"/>
-      <w:r>
-        <w:rPr>
-          <w:sz w:val="22"/>
-        </w:rPr>
-        <w:t>stat</w:t>
-      </w:r>
-      <w:proofErr w:type="spellEnd"/>
-      <w:r>
-        <w:rPr>
-          <w:sz w:val="22"/>
-        </w:rPr>
-        <w:t xml:space="preserve"> </w:t>
-      </w:r>
-      <w:proofErr w:type="spellStart"/>
-      <w:r>
-        <w:rPr>
-          <w:sz w:val="22"/>
-        </w:rPr>
-        <w:t>ze</w:t>
-      </w:r>
-      <w:proofErr w:type="spellEnd"/>
-      <w:r>
-        <w:rPr>
-          <w:sz w:val="22"/>
-        </w:rPr>
-        <w:t xml:space="preserve"> </w:t>
-      </w:r>
-      <w:proofErr w:type="spellStart"/>
-      <w:r>
-        <w:rPr>
-          <w:sz w:val="22"/>
-        </w:rPr>
-        <w:t>Wienne</w:t>
-      </w:r>
-      <w:proofErr w:type="spellEnd"/>
-      <w:r>
-        <w:rPr>
-          <w:sz w:val="22"/>
-        </w:rPr>
-        <w:t xml:space="preserve"> 1 </w:t>
-      </w:r>
-      <w:proofErr w:type="spellStart"/>
-      <w:r>
-        <w:rPr>
-          <w:sz w:val="22"/>
-        </w:rPr>
-        <w:t>lb</w:t>
-      </w:r>
-      <w:proofErr w:type="spellEnd"/>
-      <w:r>
-        <w:rPr>
-          <w:sz w:val="22"/>
-        </w:rPr>
-        <w:t xml:space="preserve"> </w:t>
-      </w:r>
-      <w:proofErr w:type="spellStart"/>
-      <w:r>
-        <w:rPr>
-          <w:sz w:val="22"/>
-        </w:rPr>
-        <w:t>dn</w:t>
-      </w:r>
-      <w:proofErr w:type="spellEnd"/>
-      <w:r>
-        <w:rPr>
-          <w:sz w:val="22"/>
-        </w:rPr>
-        <w:t xml:space="preserve">. gelts </w:t>
-      </w:r>
-      <w:proofErr w:type="spellStart"/>
-      <w:r>
-        <w:rPr>
-          <w:sz w:val="22"/>
-        </w:rPr>
-        <w:t>purchrechts</w:t>
-      </w:r>
-      <w:proofErr w:type="spellEnd"/>
-      <w:r>
-        <w:rPr>
-          <w:sz w:val="22"/>
-        </w:rPr>
-        <w:t xml:space="preserve"> (ablösbar) auf ihrem Hause in der </w:t>
-      </w:r>
-      <w:proofErr w:type="spellStart"/>
-      <w:r>
-        <w:rPr>
-          <w:sz w:val="22"/>
-        </w:rPr>
-        <w:t>Chêrnerstrasse</w:t>
-      </w:r>
-      <w:proofErr w:type="spellEnd"/>
-      <w:r>
-        <w:rPr>
-          <w:sz w:val="22"/>
-        </w:rPr>
-        <w:t xml:space="preserve"> </w:t>
-      </w:r>
-      <w:proofErr w:type="spellStart"/>
-      <w:r>
-        <w:rPr>
-          <w:sz w:val="22"/>
-        </w:rPr>
-        <w:t>ze</w:t>
-      </w:r>
-      <w:proofErr w:type="spellEnd"/>
-      <w:r>
-        <w:rPr>
-          <w:sz w:val="22"/>
-        </w:rPr>
-        <w:t xml:space="preserve"> </w:t>
-      </w:r>
-      <w:proofErr w:type="spellStart"/>
-      <w:r>
-        <w:rPr>
-          <w:sz w:val="22"/>
-        </w:rPr>
-        <w:t>Wienne</w:t>
-      </w:r>
-      <w:proofErr w:type="spellEnd"/>
-      <w:r>
-        <w:rPr>
-          <w:sz w:val="22"/>
-        </w:rPr>
-        <w:t xml:space="preserve"> </w:t>
-      </w:r>
-      <w:proofErr w:type="spellStart"/>
-      <w:r>
-        <w:rPr>
-          <w:sz w:val="22"/>
-        </w:rPr>
-        <w:t>zenaechst</w:t>
-      </w:r>
-      <w:proofErr w:type="spellEnd"/>
-      <w:r>
-        <w:rPr>
-          <w:sz w:val="22"/>
-        </w:rPr>
-        <w:t xml:space="preserve"> der </w:t>
-      </w:r>
-      <w:proofErr w:type="spellStart"/>
-      <w:r>
-        <w:rPr>
-          <w:sz w:val="22"/>
-        </w:rPr>
-        <w:t>Heiligengaester</w:t>
-      </w:r>
-      <w:proofErr w:type="spellEnd"/>
-      <w:r>
-        <w:rPr>
-          <w:sz w:val="22"/>
-        </w:rPr>
-        <w:t xml:space="preserve"> </w:t>
-      </w:r>
-      <w:proofErr w:type="spellStart"/>
-      <w:r>
-        <w:rPr>
-          <w:sz w:val="22"/>
-        </w:rPr>
-        <w:t>cheller</w:t>
-      </w:r>
-      <w:proofErr w:type="spellEnd"/>
-      <w:r>
-        <w:rPr>
-          <w:sz w:val="22"/>
-        </w:rPr>
-        <w:t xml:space="preserve"> und dem </w:t>
-      </w:r>
-      <w:proofErr w:type="spellStart"/>
-      <w:r>
-        <w:rPr>
-          <w:sz w:val="22"/>
-        </w:rPr>
-        <w:t>haus</w:t>
-      </w:r>
-      <w:proofErr w:type="spellEnd"/>
-      <w:r>
-        <w:rPr>
-          <w:sz w:val="22"/>
-        </w:rPr>
-        <w:t xml:space="preserve">, das </w:t>
-      </w:r>
-      <w:proofErr w:type="spellStart"/>
-      <w:r>
-        <w:rPr>
-          <w:sz w:val="22"/>
-        </w:rPr>
-        <w:t>weiln</w:t>
-      </w:r>
-      <w:proofErr w:type="spellEnd"/>
-      <w:r>
-        <w:rPr>
-          <w:sz w:val="22"/>
-        </w:rPr>
-        <w:t xml:space="preserve"> </w:t>
-      </w:r>
-      <w:proofErr w:type="spellStart"/>
-      <w:r>
-        <w:rPr>
-          <w:sz w:val="22"/>
-        </w:rPr>
-        <w:t>hern</w:t>
-      </w:r>
-      <w:proofErr w:type="spellEnd"/>
-      <w:r>
-        <w:rPr>
-          <w:sz w:val="22"/>
-        </w:rPr>
-        <w:t xml:space="preserve"> </w:t>
-      </w:r>
-      <w:proofErr w:type="spellStart"/>
-      <w:r>
-        <w:rPr>
-          <w:sz w:val="22"/>
-        </w:rPr>
-        <w:t>Chunrats</w:t>
-      </w:r>
-      <w:proofErr w:type="spellEnd"/>
-      <w:r>
-        <w:rPr>
-          <w:sz w:val="22"/>
-        </w:rPr>
-        <w:t xml:space="preserve"> des </w:t>
-      </w:r>
-      <w:proofErr w:type="spellStart"/>
-      <w:r>
-        <w:rPr>
-          <w:sz w:val="22"/>
-        </w:rPr>
-        <w:t>Herschêftleins</w:t>
-      </w:r>
-      <w:proofErr w:type="spellEnd"/>
-      <w:r>
-        <w:rPr>
-          <w:sz w:val="22"/>
-        </w:rPr>
-        <w:t xml:space="preserve"> gewesen ist, um 8 </w:t>
-      </w:r>
-      <w:proofErr w:type="spellStart"/>
-      <w:r>
-        <w:rPr>
-          <w:sz w:val="22"/>
-        </w:rPr>
-        <w:t>lb</w:t>
-      </w:r>
-      <w:proofErr w:type="spellEnd"/>
-      <w:r>
-        <w:rPr>
-          <w:sz w:val="22"/>
-        </w:rPr>
-        <w:t xml:space="preserve"> </w:t>
-      </w:r>
-      <w:proofErr w:type="spellStart"/>
-      <w:r>
-        <w:rPr>
-          <w:sz w:val="22"/>
-        </w:rPr>
-        <w:t>dn</w:t>
-      </w:r>
-      <w:proofErr w:type="spellEnd"/>
-      <w:r>
-        <w:rPr>
-          <w:sz w:val="22"/>
-        </w:rPr>
-        <w:t xml:space="preserve">. </w:t>
-      </w:r>
-      <w:proofErr w:type="spellStart"/>
-      <w:r>
-        <w:rPr>
-          <w:sz w:val="22"/>
-        </w:rPr>
-        <w:t>hern</w:t>
-      </w:r>
-      <w:proofErr w:type="spellEnd"/>
-      <w:r>
-        <w:rPr>
-          <w:sz w:val="22"/>
-        </w:rPr>
-        <w:t xml:space="preserve"> Jansen dem </w:t>
-      </w:r>
-      <w:proofErr w:type="spellStart"/>
-      <w:r>
-        <w:rPr>
-          <w:sz w:val="22"/>
-        </w:rPr>
-        <w:t>Urbêtschen</w:t>
-      </w:r>
-      <w:proofErr w:type="spellEnd"/>
-      <w:r>
-        <w:rPr>
-          <w:sz w:val="22"/>
-        </w:rPr>
-        <w:t>.“</w:t>
-      </w:r>
-    </w:p>
-    <w:p>
-      <w:r>
-        <w:rPr>
-          <w:sz w:val="22"/>
-        </w:rPr>
-        <w:t xml:space="preserve">„Besiegelt mit dem städtischen Grundsiegel und dem Siegel </w:t>
-      </w:r>
-      <w:proofErr w:type="spellStart"/>
-      <w:r>
-        <w:rPr>
-          <w:sz w:val="22"/>
-        </w:rPr>
-        <w:t>hern</w:t>
-      </w:r>
-      <w:proofErr w:type="spellEnd"/>
-      <w:r>
-        <w:rPr>
-          <w:sz w:val="22"/>
-        </w:rPr>
-        <w:t xml:space="preserve"> </w:t>
-      </w:r>
-      <w:proofErr w:type="spellStart"/>
-      <w:r>
-        <w:rPr>
-          <w:sz w:val="22"/>
-        </w:rPr>
-        <w:t>Leupolts</w:t>
-      </w:r>
-      <w:proofErr w:type="spellEnd"/>
-      <w:r>
-        <w:rPr>
-          <w:sz w:val="22"/>
-        </w:rPr>
-        <w:t xml:space="preserve"> des </w:t>
-      </w:r>
-      <w:proofErr w:type="spellStart"/>
-      <w:r>
-        <w:rPr>
-          <w:sz w:val="22"/>
-        </w:rPr>
-        <w:t>Polczs</w:t>
-      </w:r>
-      <w:proofErr w:type="spellEnd"/>
-      <w:r>
-        <w:rPr>
-          <w:sz w:val="22"/>
-        </w:rPr>
-        <w:t xml:space="preserve">, des </w:t>
-      </w:r>
-      <w:proofErr w:type="spellStart"/>
-      <w:r>
-        <w:rPr>
-          <w:sz w:val="22"/>
-        </w:rPr>
-        <w:t>rates</w:t>
-      </w:r>
-      <w:proofErr w:type="spellEnd"/>
-      <w:r>
-        <w:rPr>
-          <w:sz w:val="22"/>
-        </w:rPr>
-        <w:t xml:space="preserve"> der </w:t>
-      </w:r>
-      <w:proofErr w:type="spellStart"/>
-      <w:r>
-        <w:rPr>
-          <w:sz w:val="22"/>
-        </w:rPr>
-        <w:t>stat</w:t>
-      </w:r>
-      <w:proofErr w:type="spellEnd"/>
-      <w:r>
-        <w:rPr>
-          <w:sz w:val="22"/>
-        </w:rPr>
-        <w:t xml:space="preserve"> </w:t>
-      </w:r>
-      <w:proofErr w:type="spellStart"/>
-      <w:r>
-        <w:rPr>
-          <w:sz w:val="22"/>
-        </w:rPr>
-        <w:t>ze</w:t>
-      </w:r>
-      <w:proofErr w:type="spellEnd"/>
-      <w:r>
-        <w:rPr>
-          <w:sz w:val="22"/>
-        </w:rPr>
-        <w:t xml:space="preserve"> </w:t>
-      </w:r>
-      <w:proofErr w:type="spellStart"/>
-      <w:r>
-        <w:rPr>
-          <w:sz w:val="22"/>
-        </w:rPr>
-        <w:t>Wienne</w:t>
-      </w:r>
-      <w:proofErr w:type="spellEnd"/>
-      <w:r>
-        <w:rPr>
-          <w:sz w:val="22"/>
-        </w:rPr>
-        <w:t>.“</w:t>
-      </w:r>
-    </w:p>
-    <w:p>
-      <w:pPr>
-        <w:rPr>
-          <w:b/>
-          <w:bCs/>
-        </w:rPr>
-      </w:pPr>
-      <w:proofErr w:type="spellStart"/>
-      <w:r>
-        <w:rPr>
-          <w:b/>
-          <w:bCs/>
-          <w:sz w:val="22"/>
-        </w:rPr>
-        <w:t>roleNames</w:t>
-      </w:r>
-      <w:proofErr w:type="spellEnd"/>
-      <w:r>
-        <w:rPr>
-          <w:b/>
-          <w:bCs/>
-          <w:sz w:val="22"/>
-        </w:rPr>
-        <w:t xml:space="preserve"> im Beispiel:</w:t>
-      </w:r>
-    </w:p>
-    <w:p>
-      <w:r>
-        <w:rPr>
-          <w:sz w:val="22"/>
-        </w:rPr>
-        <w:t xml:space="preserve">• </w:t>
-      </w:r>
-      <w:proofErr w:type="spellStart"/>
-      <w:proofErr w:type="gramStart"/>
-      <w:r>
-        <w:rPr>
-          <w:sz w:val="22"/>
-        </w:rPr>
-        <w:t>Aussteller</w:t>
-      </w:r>
-      <w:r>
-        <w:rPr>
-          <w:sz w:val="22"/>
-        </w:rPr>
-        <w:t>:</w:t>
-      </w:r>
-      <w:r>
-        <w:rPr>
-          <w:sz w:val="22"/>
-        </w:rPr>
-        <w:t>in</w:t>
-      </w:r>
-      <w:r>
-        <w:rPr>
-          <w:sz w:val="22"/>
-        </w:rPr>
-        <w:t>nen</w:t>
-      </w:r>
-      <w:proofErr w:type="spellEnd"/>
-      <w:proofErr w:type="gramEnd"/>
-      <w:r>
-        <w:rPr>
-          <w:sz w:val="22"/>
-        </w:rPr>
-        <w:t xml:space="preserve"> (</w:t>
-      </w:r>
-      <w:proofErr w:type="spellStart"/>
-      <w:r>
-        <w:rPr>
-          <w:sz w:val="22"/>
-        </w:rPr>
-        <w:t>issuer</w:t>
-      </w:r>
-      <w:proofErr w:type="spellEnd"/>
-      <w:r>
-        <w:rPr>
-          <w:sz w:val="22"/>
-        </w:rPr>
-        <w:t xml:space="preserve">): das Ehepaar Hainreich der </w:t>
-      </w:r>
-      <w:proofErr w:type="spellStart"/>
-      <w:r>
-        <w:rPr>
-          <w:sz w:val="22"/>
-        </w:rPr>
-        <w:t>Santwerfer</w:t>
-      </w:r>
-      <w:proofErr w:type="spellEnd"/>
-      <w:r>
-        <w:rPr>
-          <w:sz w:val="22"/>
-        </w:rPr>
-        <w:t xml:space="preserve"> und seine Hausfrau Elsbet</w:t>
-      </w:r>
-    </w:p>
-    <w:p>
-      <w:r>
-        <w:rPr>
-          <w:sz w:val="22"/>
-        </w:rPr>
-        <w:t>• Empfänger (</w:t>
-      </w:r>
-      <w:proofErr w:type="spellStart"/>
-      <w:r>
-        <w:rPr>
-          <w:sz w:val="22"/>
-        </w:rPr>
-        <w:t>recipient</w:t>
-      </w:r>
-      <w:proofErr w:type="spellEnd"/>
-      <w:r>
-        <w:rPr>
-          <w:sz w:val="22"/>
-        </w:rPr>
-        <w:t xml:space="preserve">): Jans der </w:t>
-      </w:r>
-      <w:proofErr w:type="spellStart"/>
-      <w:r>
-        <w:rPr>
-          <w:sz w:val="22"/>
-        </w:rPr>
-        <w:t>Urbetsch</w:t>
-      </w:r>
-      <w:proofErr w:type="spellEnd"/>
-    </w:p>
-    <w:p>
-      <w:r>
-        <w:rPr>
-          <w:sz w:val="22"/>
-        </w:rPr>
-        <w:t xml:space="preserve">• „mit </w:t>
-      </w:r>
-      <w:proofErr w:type="spellStart"/>
-      <w:r>
-        <w:rPr>
-          <w:sz w:val="22"/>
-        </w:rPr>
-        <w:t>Handen</w:t>
-      </w:r>
-      <w:proofErr w:type="spellEnd"/>
-      <w:r>
-        <w:rPr>
-          <w:sz w:val="22"/>
-        </w:rPr>
-        <w:t>“ (</w:t>
-      </w:r>
-      <w:proofErr w:type="spellStart"/>
-      <w:r>
-        <w:rPr>
-          <w:sz w:val="22"/>
-        </w:rPr>
-        <w:t>other</w:t>
-      </w:r>
-      <w:proofErr w:type="spellEnd"/>
-      <w:r>
-        <w:rPr>
-          <w:sz w:val="22"/>
-        </w:rPr>
-        <w:t xml:space="preserve">): Bürgermeister Jans von </w:t>
-      </w:r>
-      <w:proofErr w:type="spellStart"/>
-      <w:r>
-        <w:rPr>
-          <w:sz w:val="22"/>
-        </w:rPr>
-        <w:t>Tirnach</w:t>
-      </w:r>
-      <w:proofErr w:type="spellEnd"/>
-      <w:r>
-        <w:rPr>
-          <w:sz w:val="22"/>
-        </w:rPr>
-        <w:t xml:space="preserve"> (zugleich Münzmeister) und der Rat der Stadt Wien</w:t>
-      </w:r>
-    </w:p>
-    <w:p>
-      <w:r>
-        <w:rPr>
-          <w:sz w:val="22"/>
-        </w:rPr>
-        <w:t>• Zeug</w:t>
-      </w:r>
-      <w:r>
-        <w:rPr>
-          <w:sz w:val="22"/>
-        </w:rPr>
-        <w:t>en</w:t>
-      </w:r>
-      <w:r>
-        <w:rPr>
-          <w:sz w:val="22"/>
-        </w:rPr>
-        <w:t>/ Siegler (</w:t>
-      </w:r>
-      <w:proofErr w:type="spellStart"/>
-      <w:r>
-        <w:rPr>
-          <w:sz w:val="22"/>
-        </w:rPr>
-        <w:t>witness</w:t>
-      </w:r>
-      <w:proofErr w:type="spellEnd"/>
-      <w:r>
-        <w:rPr>
-          <w:sz w:val="22"/>
-        </w:rPr>
-        <w:t xml:space="preserve"> / </w:t>
-      </w:r>
-      <w:proofErr w:type="spellStart"/>
-      <w:r>
-        <w:rPr>
-          <w:sz w:val="22"/>
-        </w:rPr>
-        <w:t>sealer</w:t>
-      </w:r>
-      <w:proofErr w:type="spellEnd"/>
-      <w:r>
-        <w:rPr>
-          <w:sz w:val="22"/>
-        </w:rPr>
-        <w:t xml:space="preserve">): </w:t>
-      </w:r>
-      <w:r>
-        <w:rPr>
-          <w:sz w:val="22"/>
-        </w:rPr>
-        <w:t>Stadtrat und</w:t>
-      </w:r>
-      <w:r>
-        <w:rPr>
-          <w:sz w:val="22"/>
-        </w:rPr>
-        <w:t xml:space="preserve"> Ratsmitglied</w:t>
-      </w:r>
-      <w:r>
-        <w:rPr>
-          <w:sz w:val="22"/>
-        </w:rPr>
-        <w:t xml:space="preserve"> Leopold Polz</w:t>
-      </w:r>
-    </w:p>
-    <w:p>
-      <w:pPr>
-        <w:rPr>
-          <w:sz w:val="22"/>
-        </w:rPr>
-      </w:pPr>
-      <w:r>
-        <w:rPr>
-          <w:sz w:val="22"/>
-        </w:rPr>
-        <w:t>• Ämter (</w:t>
-      </w:r>
-      <w:proofErr w:type="spellStart"/>
-      <w:r>
-        <w:rPr>
-          <w:sz w:val="22"/>
-        </w:rPr>
-        <w:t>occ</w:t>
-      </w:r>
-      <w:proofErr w:type="spellEnd"/>
-      <w:r>
-        <w:rPr>
-          <w:sz w:val="22"/>
-        </w:rPr>
-        <w:t xml:space="preserve">): Bürgermeister, Münzmeister, Ratsmitglied </w:t>
-      </w:r>
-      <w:proofErr w:type="gramStart"/>
-      <w:r>
-        <w:rPr>
-          <w:sz w:val="22"/>
-        </w:rPr>
-        <w:t xml:space="preserve">– </w:t>
-      </w:r>
-      <w:r>
-        <w:rPr>
-          <w:sz w:val="22"/>
-        </w:rPr>
-        <w:t xml:space="preserve"> an</w:t>
-      </w:r>
-      <w:proofErr w:type="gramEnd"/>
-      <w:r>
-        <w:rPr>
-          <w:sz w:val="22"/>
-        </w:rPr>
-        <w:t xml:space="preserve"> die Stadt Wien gebunden</w:t>
-      </w:r>
-    </w:p>
-    <w:p>
-      <w:r>
-        <w:rPr>
-          <w:sz w:val="22"/>
-        </w:rPr>
-        <w:t xml:space="preserve">• Rechtsgeschäft: Verkauf · Geld/Besitz: 8 Pfund Pfennig; ablösbares Burgrecht auf dem Haus </w:t>
-      </w:r>
-    </w:p>
-    <w:p>
-      <w:r>
-        <w:rPr>
-          <w:b/>
-          <w:sz w:val="22"/>
-        </w:rPr>
-        <w:t>Fallbeispiel 2</w:t>
-      </w:r>
-      <w:r>
-        <w:rPr>
-          <w:b/>
-          <w:sz w:val="22"/>
-        </w:rPr>
-        <w:t xml:space="preserve">: </w:t>
-      </w:r>
-      <w:r>
-        <w:rPr>
-          <w:b/>
-          <w:sz w:val="22"/>
-        </w:rPr>
-        <w:t>Schenkung für das Seelenheil an ein Kloster (</w:t>
-      </w:r>
-      <w:r>
-        <w:rPr>
-          <w:b/>
-          <w:sz w:val="22"/>
-        </w:rPr>
-        <w:t>Nr.</w:t>
-      </w:r>
-      <w:r>
-        <w:rPr>
-          <w:b/>
-          <w:sz w:val="22"/>
-        </w:rPr>
-        <w:t xml:space="preserve"> 16</w:t>
-      </w:r>
-      <w:r>
-        <w:rPr>
-          <w:b/>
-          <w:sz w:val="22"/>
-        </w:rPr>
-        <w:t>)</w:t>
-      </w:r>
-    </w:p>
-    <w:p>
-      <w:pPr>
-        <w:spacing w:line="276" w:lineRule="auto"/>
-        <w:rPr>
-          <w:sz w:val="22"/>
-        </w:rPr>
-      </w:pPr>
-      <w:r>
-        <w:rPr>
-          <w:sz w:val="22"/>
-        </w:rPr>
-        <w:t>Link zum Frontend:</w:t>
-      </w:r>
-      <w:r>
-        <w:rPr>
-          <w:sz w:val="22"/>
-        </w:rPr>
-        <w:br/>
-      </w:r>
-      <w:hyperlink r:id="rId27" w:history="1">
-        <w:r>
-          <w:rPr>
-            <w:rStyle w:val="Hyperlink"/>
-            <w:sz w:val="22"/>
-          </w:rPr>
-          <w:t>https://chpollin.github.io/db_for_medieval_legal_transactions_edition/documents/QGW/Vienna_1177-1414_ready/16.html</w:t>
-        </w:r>
-      </w:hyperlink>
-    </w:p>
-    <w:p>
-      <w:pPr>
-        <w:rPr>
-          <w:sz w:val="22"/>
-        </w:rPr>
-      </w:pPr>
-      <w:r>
-        <w:rPr>
-          <w:sz w:val="22"/>
-        </w:rPr>
-        <w:t xml:space="preserve">„Benedicta de </w:t>
-      </w:r>
-      <w:proofErr w:type="spellStart"/>
-      <w:r>
-        <w:rPr>
-          <w:sz w:val="22"/>
-        </w:rPr>
-        <w:t>Arnstain</w:t>
-      </w:r>
-      <w:proofErr w:type="spellEnd"/>
-      <w:r>
-        <w:rPr>
-          <w:sz w:val="22"/>
-        </w:rPr>
-        <w:t xml:space="preserve"> schenkt für das Seelenheil ihres Bruders und den Nachlass ihrer Sünden der </w:t>
-      </w:r>
-      <w:proofErr w:type="spellStart"/>
-      <w:r>
-        <w:rPr>
-          <w:sz w:val="22"/>
-        </w:rPr>
-        <w:t>Aebtissin</w:t>
-      </w:r>
-      <w:proofErr w:type="spellEnd"/>
-      <w:r>
-        <w:rPr>
-          <w:sz w:val="22"/>
-        </w:rPr>
-        <w:t xml:space="preserve"> und dem Collegium der Nonnen bei S. Nikolaus zu Wien die curia </w:t>
-      </w:r>
-      <w:proofErr w:type="spellStart"/>
-      <w:r>
-        <w:rPr>
-          <w:sz w:val="22"/>
-        </w:rPr>
-        <w:t>Ebonis</w:t>
-      </w:r>
-      <w:proofErr w:type="spellEnd"/>
-      <w:r>
-        <w:rPr>
-          <w:sz w:val="22"/>
-        </w:rPr>
-        <w:t xml:space="preserve"> und einen Weingarten, beides </w:t>
-      </w:r>
-      <w:proofErr w:type="spellStart"/>
-      <w:r>
-        <w:rPr>
-          <w:sz w:val="22"/>
-        </w:rPr>
-        <w:t>ausserhalb</w:t>
-      </w:r>
-      <w:proofErr w:type="spellEnd"/>
-      <w:r>
-        <w:rPr>
-          <w:sz w:val="22"/>
-        </w:rPr>
-        <w:t xml:space="preserve"> der Mauern der Stadt Krems gelegen.“</w:t>
-      </w:r>
-    </w:p>
-    <w:p>
-      <w:pPr>
-        <w:rPr>
-          <w:sz w:val="22"/>
-        </w:rPr>
-      </w:pPr>
-      <w:r>
-        <w:rPr>
-          <w:sz w:val="22"/>
-        </w:rPr>
-        <w:t>„Siegler: der Gemahl der Ausstellerin“</w:t>
-      </w:r>
-    </w:p>
-    <w:p>
-      <w:pPr>
-        <w:rPr>
-          <w:b/>
-          <w:bCs/>
-        </w:rPr>
-      </w:pPr>
-      <w:proofErr w:type="spellStart"/>
-      <w:r>
-        <w:rPr>
-          <w:b/>
-          <w:bCs/>
-          <w:sz w:val="22"/>
-        </w:rPr>
-        <w:t>roleNames</w:t>
-      </w:r>
-      <w:proofErr w:type="spellEnd"/>
-      <w:r>
-        <w:rPr>
-          <w:b/>
-          <w:bCs/>
-          <w:sz w:val="22"/>
-        </w:rPr>
-        <w:t xml:space="preserve"> im Beispiel:</w:t>
-      </w:r>
-    </w:p>
-    <w:p>
-      <w:r>
-        <w:rPr>
-          <w:sz w:val="22"/>
-        </w:rPr>
-        <w:t>• Ausstellerin (</w:t>
-      </w:r>
-      <w:proofErr w:type="spellStart"/>
-      <w:r>
-        <w:rPr>
-          <w:sz w:val="22"/>
-        </w:rPr>
-        <w:t>issuer</w:t>
-      </w:r>
-      <w:proofErr w:type="spellEnd"/>
-      <w:r>
-        <w:rPr>
-          <w:sz w:val="22"/>
-        </w:rPr>
-        <w:t>):</w:t>
-      </w:r>
-      <w:r>
-        <w:rPr>
-          <w:sz w:val="22"/>
-        </w:rPr>
-        <w:t xml:space="preserve"> Person,</w:t>
-      </w:r>
-      <w:r>
-        <w:rPr>
-          <w:sz w:val="22"/>
-        </w:rPr>
-        <w:t xml:space="preserve"> Benedicta de Arnstain</w:t>
-      </w:r>
-    </w:p>
-    <w:p>
-      <w:r>
-        <w:rPr>
-          <w:sz w:val="22"/>
-        </w:rPr>
-        <w:t>• Empfängerin (</w:t>
-      </w:r>
-      <w:proofErr w:type="spellStart"/>
-      <w:r>
-        <w:rPr>
-          <w:sz w:val="22"/>
-        </w:rPr>
-        <w:t>recipient</w:t>
-      </w:r>
-      <w:proofErr w:type="spellEnd"/>
-      <w:r>
-        <w:rPr>
-          <w:sz w:val="22"/>
-        </w:rPr>
-        <w:t>): Institution</w:t>
-      </w:r>
-      <w:r>
-        <w:rPr>
-          <w:sz w:val="22"/>
-        </w:rPr>
-        <w:t>,</w:t>
-      </w:r>
-      <w:r>
-        <w:rPr>
-          <w:sz w:val="22"/>
-        </w:rPr>
-        <w:t xml:space="preserve"> d</w:t>
-      </w:r>
-      <w:r>
-        <w:rPr>
-          <w:sz w:val="22"/>
-        </w:rPr>
-        <w:t>er</w:t>
-      </w:r>
-      <w:r>
-        <w:rPr>
-          <w:sz w:val="22"/>
-        </w:rPr>
-        <w:t xml:space="preserve"> </w:t>
-      </w:r>
-      <w:r>
-        <w:rPr>
-          <w:sz w:val="22"/>
-        </w:rPr>
-        <w:t>Nonnenkonvent</w:t>
-      </w:r>
-      <w:r>
-        <w:rPr>
-          <w:sz w:val="22"/>
-        </w:rPr>
-        <w:t xml:space="preserve"> St. </w:t>
-      </w:r>
-      <w:r>
-        <w:rPr>
-          <w:sz w:val="22"/>
-        </w:rPr>
-        <w:t>Niklas</w:t>
-      </w:r>
-    </w:p>
-    <w:p>
-      <w:r>
-        <w:rPr>
-          <w:sz w:val="22"/>
-        </w:rPr>
-        <w:t>• Siegler (</w:t>
-      </w:r>
-      <w:proofErr w:type="spellStart"/>
-      <w:r>
-        <w:rPr>
-          <w:sz w:val="22"/>
-        </w:rPr>
-        <w:t>sealer</w:t>
-      </w:r>
-      <w:proofErr w:type="spellEnd"/>
-      <w:r>
-        <w:rPr>
-          <w:sz w:val="22"/>
-        </w:rPr>
-        <w:t xml:space="preserve">): ihr Ehemann siegelt für sie </w:t>
-      </w:r>
-    </w:p>
-    <w:p>
-      <w:r>
-        <w:rPr>
-          <w:sz w:val="22"/>
-        </w:rPr>
-        <w:t>• Rechtsgeschäft: Schenkung für das Seelenheil ihres Bruders</w:t>
-      </w:r>
-    </w:p>
-    <w:p>
-      <w:pPr>
-        <w:rPr>
-          <w:b/>
-          <w:sz w:val="22"/>
-        </w:rPr>
-      </w:pPr>
-    </w:p>
-    <w:p>
-      <w:r>
-        <w:rPr>
-          <w:b/>
-          <w:sz w:val="22"/>
-        </w:rPr>
-        <w:lastRenderedPageBreak/>
-        <w:t>Fallbeispiel 3</w:t>
-      </w:r>
-      <w:r>
-        <w:rPr>
-          <w:b/>
-          <w:sz w:val="22"/>
-        </w:rPr>
-        <w:t xml:space="preserve">: </w:t>
-      </w:r>
-      <w:r>
-        <w:rPr>
-          <w:b/>
-          <w:sz w:val="22"/>
-        </w:rPr>
-        <w:t>e</w:t>
-      </w:r>
-      <w:r>
-        <w:rPr>
-          <w:b/>
-          <w:sz w:val="22"/>
-        </w:rPr>
-        <w:t xml:space="preserve">ine Witwe vergibt </w:t>
-      </w:r>
-      <w:r>
-        <w:rPr>
-          <w:b/>
-          <w:sz w:val="22"/>
-        </w:rPr>
-        <w:t xml:space="preserve">Erbe </w:t>
-      </w:r>
-      <w:r>
-        <w:rPr>
-          <w:b/>
-          <w:sz w:val="22"/>
-        </w:rPr>
-        <w:t>(Urkunde 1869</w:t>
-      </w:r>
-      <w:r>
-        <w:rPr>
-          <w:b/>
-          <w:sz w:val="22"/>
-        </w:rPr>
-        <w:t>)</w:t>
-      </w:r>
-    </w:p>
-    <w:p>
-      <w:pPr>
-        <w:rPr>
-          <w:sz w:val="22"/>
-        </w:rPr>
-      </w:pPr>
-      <w:r>
-        <w:rPr>
-          <w:sz w:val="22"/>
-        </w:rPr>
-        <w:t>Link zum Frontend:</w:t>
-      </w:r>
-      <w:r>
-        <w:rPr>
-          <w:sz w:val="22"/>
-        </w:rPr>
-        <w:br/>
-      </w:r>
-      <w:hyperlink r:id="rId28" w:history="1">
-        <w:r>
-          <w:rPr>
-            <w:rStyle w:val="Hyperlink"/>
-            <w:sz w:val="22"/>
-          </w:rPr>
-          <w:t>https://chpollin.github.io/db_for_medieval_legal_transactions_edition/documents/QGW/Vienna_1177-1414_ready/1869.html</w:t>
-        </w:r>
-      </w:hyperlink>
-      <w:r>
-        <w:rPr>
-          <w:sz w:val="22"/>
-        </w:rPr>
-        <w:t xml:space="preserve"> </w:t>
-      </w:r>
-    </w:p>
-    <w:p>
-      <w:pPr>
-        <w:rPr>
-          <w:sz w:val="22"/>
-        </w:rPr>
-      </w:pPr>
-      <w:r>
-        <w:rPr>
-          <w:sz w:val="22"/>
-        </w:rPr>
-        <w:t xml:space="preserve">„Margret, </w:t>
-      </w:r>
-      <w:proofErr w:type="spellStart"/>
-      <w:r>
-        <w:rPr>
-          <w:sz w:val="22"/>
-        </w:rPr>
-        <w:t>Niclass</w:t>
-      </w:r>
-      <w:proofErr w:type="spellEnd"/>
-      <w:r>
-        <w:rPr>
-          <w:sz w:val="22"/>
-        </w:rPr>
-        <w:t xml:space="preserve">, des </w:t>
-      </w:r>
-      <w:proofErr w:type="spellStart"/>
-      <w:r>
-        <w:rPr>
-          <w:sz w:val="22"/>
-        </w:rPr>
-        <w:t>fleischakcher</w:t>
-      </w:r>
-      <w:proofErr w:type="spellEnd"/>
-      <w:r>
-        <w:rPr>
-          <w:sz w:val="22"/>
-        </w:rPr>
-        <w:t xml:space="preserve">, </w:t>
-      </w:r>
-      <w:proofErr w:type="spellStart"/>
-      <w:r>
-        <w:rPr>
-          <w:sz w:val="22"/>
-        </w:rPr>
-        <w:t>witib</w:t>
-      </w:r>
-      <w:proofErr w:type="spellEnd"/>
-      <w:r>
-        <w:rPr>
-          <w:sz w:val="22"/>
-        </w:rPr>
-        <w:t xml:space="preserve"> </w:t>
-      </w:r>
-      <w:proofErr w:type="spellStart"/>
-      <w:r>
-        <w:rPr>
-          <w:sz w:val="22"/>
-        </w:rPr>
-        <w:t>ze</w:t>
-      </w:r>
-      <w:proofErr w:type="spellEnd"/>
-      <w:r>
-        <w:rPr>
-          <w:sz w:val="22"/>
-        </w:rPr>
-        <w:t xml:space="preserve"> </w:t>
-      </w:r>
-      <w:proofErr w:type="spellStart"/>
-      <w:r>
-        <w:rPr>
-          <w:sz w:val="22"/>
-        </w:rPr>
-        <w:t>Wienn</w:t>
-      </w:r>
-      <w:proofErr w:type="spellEnd"/>
-      <w:r>
-        <w:rPr>
-          <w:sz w:val="22"/>
-        </w:rPr>
-        <w:t xml:space="preserve">, gibt ihrem Vetter </w:t>
-      </w:r>
-      <w:proofErr w:type="spellStart"/>
-      <w:r>
-        <w:rPr>
-          <w:sz w:val="22"/>
-        </w:rPr>
-        <w:t>Hannsen</w:t>
-      </w:r>
-      <w:proofErr w:type="spellEnd"/>
-      <w:r>
-        <w:rPr>
-          <w:sz w:val="22"/>
-        </w:rPr>
-        <w:t xml:space="preserve"> von </w:t>
-      </w:r>
-      <w:proofErr w:type="spellStart"/>
-      <w:r>
-        <w:rPr>
-          <w:sz w:val="22"/>
-        </w:rPr>
-        <w:t>Künigsprunn</w:t>
-      </w:r>
-      <w:proofErr w:type="spellEnd"/>
-      <w:r>
-        <w:rPr>
-          <w:sz w:val="22"/>
-        </w:rPr>
-        <w:t xml:space="preserve"> alles das gut und hab, so ihr von ihrer Schwester </w:t>
-      </w:r>
-      <w:proofErr w:type="spellStart"/>
-      <w:r>
-        <w:rPr>
-          <w:sz w:val="22"/>
-        </w:rPr>
-        <w:t>fraun</w:t>
-      </w:r>
-      <w:proofErr w:type="spellEnd"/>
-      <w:r>
-        <w:rPr>
-          <w:sz w:val="22"/>
-        </w:rPr>
-        <w:t xml:space="preserve"> Margreten seligen, </w:t>
-      </w:r>
-      <w:proofErr w:type="spellStart"/>
-      <w:r>
-        <w:rPr>
-          <w:sz w:val="22"/>
-        </w:rPr>
-        <w:t>etwenn</w:t>
-      </w:r>
-      <w:proofErr w:type="spellEnd"/>
-      <w:r>
-        <w:rPr>
-          <w:sz w:val="22"/>
-        </w:rPr>
-        <w:t xml:space="preserve"> </w:t>
-      </w:r>
-      <w:proofErr w:type="spellStart"/>
-      <w:r>
-        <w:rPr>
-          <w:sz w:val="22"/>
-        </w:rPr>
-        <w:t>wirtin</w:t>
-      </w:r>
-      <w:proofErr w:type="spellEnd"/>
-      <w:r>
-        <w:rPr>
-          <w:sz w:val="22"/>
-        </w:rPr>
-        <w:t xml:space="preserve"> </w:t>
-      </w:r>
-      <w:proofErr w:type="spellStart"/>
-      <w:r>
-        <w:rPr>
-          <w:sz w:val="22"/>
-        </w:rPr>
-        <w:t>in des</w:t>
-      </w:r>
-      <w:proofErr w:type="spellEnd"/>
-      <w:r>
-        <w:rPr>
-          <w:sz w:val="22"/>
-        </w:rPr>
-        <w:t xml:space="preserve"> </w:t>
-      </w:r>
-      <w:proofErr w:type="spellStart"/>
-      <w:r>
-        <w:rPr>
-          <w:sz w:val="22"/>
-        </w:rPr>
-        <w:t>graven</w:t>
-      </w:r>
-      <w:proofErr w:type="spellEnd"/>
-      <w:r>
-        <w:rPr>
-          <w:sz w:val="22"/>
-        </w:rPr>
-        <w:t xml:space="preserve"> von </w:t>
-      </w:r>
-      <w:proofErr w:type="spellStart"/>
-      <w:r>
-        <w:rPr>
-          <w:sz w:val="22"/>
-        </w:rPr>
-        <w:t>Czily</w:t>
-      </w:r>
-      <w:proofErr w:type="spellEnd"/>
-      <w:r>
-        <w:rPr>
-          <w:sz w:val="22"/>
-        </w:rPr>
-        <w:t xml:space="preserve"> </w:t>
-      </w:r>
-      <w:proofErr w:type="spellStart"/>
-      <w:r>
-        <w:rPr>
-          <w:sz w:val="22"/>
-        </w:rPr>
-        <w:t>haus</w:t>
-      </w:r>
-      <w:proofErr w:type="spellEnd"/>
-      <w:r>
-        <w:rPr>
-          <w:sz w:val="22"/>
-        </w:rPr>
-        <w:t xml:space="preserve"> in </w:t>
-      </w:r>
-      <w:proofErr w:type="spellStart"/>
-      <w:r>
-        <w:rPr>
-          <w:sz w:val="22"/>
-        </w:rPr>
-        <w:t>Wienn</w:t>
-      </w:r>
-      <w:proofErr w:type="spellEnd"/>
-      <w:r>
-        <w:rPr>
-          <w:sz w:val="22"/>
-        </w:rPr>
-        <w:t xml:space="preserve">, </w:t>
-      </w:r>
-      <w:proofErr w:type="spellStart"/>
-      <w:r>
-        <w:rPr>
-          <w:sz w:val="22"/>
-        </w:rPr>
-        <w:t>anerstorben</w:t>
-      </w:r>
-      <w:proofErr w:type="spellEnd"/>
-      <w:r>
-        <w:rPr>
-          <w:sz w:val="22"/>
-        </w:rPr>
-        <w:t xml:space="preserve"> und </w:t>
-      </w:r>
-      <w:proofErr w:type="spellStart"/>
-      <w:r>
-        <w:rPr>
-          <w:sz w:val="22"/>
-        </w:rPr>
-        <w:t>angeerbt</w:t>
-      </w:r>
-      <w:proofErr w:type="spellEnd"/>
-      <w:r>
-        <w:rPr>
-          <w:sz w:val="22"/>
-        </w:rPr>
-        <w:t xml:space="preserve"> ist.“</w:t>
-      </w:r>
-    </w:p>
-    <w:p>
-      <w:r>
-        <w:rPr>
-          <w:sz w:val="22"/>
-        </w:rPr>
-        <w:t>„</w:t>
-      </w:r>
-      <w:r>
-        <w:rPr>
-          <w:sz w:val="22"/>
-        </w:rPr>
-        <w:t xml:space="preserve">Besiegelt mit den Siegeln Jorgen des </w:t>
-      </w:r>
-      <w:proofErr w:type="spellStart"/>
-      <w:r>
-        <w:rPr>
-          <w:sz w:val="22"/>
-        </w:rPr>
-        <w:t>Grünpekchen</w:t>
-      </w:r>
-      <w:proofErr w:type="spellEnd"/>
-      <w:r>
-        <w:rPr>
-          <w:sz w:val="22"/>
-        </w:rPr>
-        <w:t xml:space="preserve"> und Marxen des </w:t>
-      </w:r>
-      <w:proofErr w:type="spellStart"/>
-      <w:r>
-        <w:rPr>
-          <w:sz w:val="22"/>
-        </w:rPr>
-        <w:t>Gödinger</w:t>
-      </w:r>
-      <w:proofErr w:type="spellEnd"/>
-      <w:r>
-        <w:rPr>
-          <w:sz w:val="22"/>
-        </w:rPr>
-        <w:t>“</w:t>
-      </w:r>
-    </w:p>
-    <w:p>
-      <w:pPr>
-        <w:rPr>
-          <w:b/>
-          <w:bCs/>
-        </w:rPr>
-      </w:pPr>
-      <w:r>
-        <w:rPr>
-          <w:b/>
-          <w:bCs/>
-          <w:sz w:val="22"/>
-        </w:rPr>
-        <w:t>Im Beispiel zu sehen:</w:t>
-      </w:r>
-    </w:p>
-    <w:p>
-      <w:r>
-        <w:rPr>
-          <w:sz w:val="22"/>
-        </w:rPr>
-        <w:t>• Ausstellerin (</w:t>
-      </w:r>
-      <w:proofErr w:type="spellStart"/>
-      <w:r>
-        <w:rPr>
-          <w:sz w:val="22"/>
-        </w:rPr>
-        <w:t>issuer</w:t>
-      </w:r>
-      <w:proofErr w:type="spellEnd"/>
-      <w:r>
-        <w:rPr>
-          <w:sz w:val="22"/>
-        </w:rPr>
-        <w:t>): Margret, Witwe des Fleischhackers Niklas</w:t>
-      </w:r>
-    </w:p>
-    <w:p>
-      <w:pPr>
-        <w:rPr>
-          <w:sz w:val="22"/>
-        </w:rPr>
-      </w:pPr>
-      <w:r>
-        <w:rPr>
-          <w:sz w:val="22"/>
-        </w:rPr>
-        <w:t>• Empfänger (</w:t>
-      </w:r>
-      <w:proofErr w:type="spellStart"/>
-      <w:r>
-        <w:rPr>
-          <w:sz w:val="22"/>
-        </w:rPr>
-        <w:t>recipient</w:t>
-      </w:r>
-      <w:proofErr w:type="spellEnd"/>
-      <w:r>
-        <w:rPr>
-          <w:sz w:val="22"/>
-        </w:rPr>
-        <w:t xml:space="preserve">): ein Verwandter, ihr Vetter Hanns von </w:t>
-      </w:r>
-      <w:proofErr w:type="spellStart"/>
-      <w:r>
-        <w:rPr>
-          <w:sz w:val="22"/>
-        </w:rPr>
-        <w:t>Künigsprunn</w:t>
-      </w:r>
-      <w:proofErr w:type="spellEnd"/>
-    </w:p>
-    <w:p>
-      <w:pPr>
-        <w:rPr>
-          <w:sz w:val="22"/>
-        </w:rPr>
-      </w:pPr>
-      <w:r>
-        <w:rPr>
-          <w:sz w:val="22"/>
-        </w:rPr>
-        <w:t>• Siegler (</w:t>
-      </w:r>
-      <w:proofErr w:type="spellStart"/>
-      <w:r>
-        <w:rPr>
-          <w:sz w:val="22"/>
-        </w:rPr>
-        <w:t>witness</w:t>
-      </w:r>
-      <w:proofErr w:type="spellEnd"/>
-      <w:r>
-        <w:rPr>
-          <w:sz w:val="22"/>
-        </w:rPr>
-        <w:t xml:space="preserve"> / </w:t>
-      </w:r>
-      <w:proofErr w:type="spellStart"/>
-      <w:r>
-        <w:rPr>
-          <w:sz w:val="22"/>
-        </w:rPr>
-        <w:t>sealer</w:t>
-      </w:r>
-      <w:proofErr w:type="spellEnd"/>
-      <w:r>
-        <w:rPr>
-          <w:sz w:val="22"/>
-        </w:rPr>
-        <w:t>): zwei Siegle</w:t>
-      </w:r>
-      <w:r>
-        <w:rPr>
-          <w:sz w:val="22"/>
-        </w:rPr>
-        <w:t>r</w:t>
-      </w:r>
-    </w:p>
-    <w:p>
-      <w:r>
-        <w:rPr>
-          <w:sz w:val="22"/>
-        </w:rPr>
-        <w:t>• Verwandtschaft (</w:t>
-      </w:r>
-      <w:proofErr w:type="spellStart"/>
-      <w:r>
-        <w:rPr>
-          <w:sz w:val="22"/>
-        </w:rPr>
-        <w:t>kin</w:t>
-      </w:r>
-      <w:proofErr w:type="spellEnd"/>
-      <w:r>
-        <w:rPr>
-          <w:sz w:val="22"/>
-        </w:rPr>
-        <w:t>): „</w:t>
-      </w:r>
-      <w:proofErr w:type="spellStart"/>
-      <w:r>
-        <w:rPr>
-          <w:sz w:val="22"/>
-        </w:rPr>
-        <w:t>witib</w:t>
-      </w:r>
-      <w:proofErr w:type="spellEnd"/>
-      <w:r>
-        <w:rPr>
-          <w:sz w:val="22"/>
-        </w:rPr>
-        <w:t>“ (Witwe), „Vetter“, „Schwester“</w:t>
-      </w:r>
-    </w:p>
-    <w:p>
-      <w:r>
-        <w:rPr>
-          <w:sz w:val="22"/>
-        </w:rPr>
-        <w:t>• Todesvermerk (</w:t>
-      </w:r>
-      <w:proofErr w:type="spellStart"/>
-      <w:r>
-        <w:rPr>
-          <w:sz w:val="22"/>
-        </w:rPr>
-        <w:t>dead</w:t>
-      </w:r>
-      <w:proofErr w:type="spellEnd"/>
-      <w:r>
-        <w:rPr>
-          <w:sz w:val="22"/>
-        </w:rPr>
-        <w:t>): die „selige“ (verstorbene) Schwester</w:t>
-      </w:r>
-    </w:p>
-    <w:p>
-      <w:r>
-        <w:rPr>
-          <w:sz w:val="22"/>
-        </w:rPr>
-        <w:t>• Beruf</w:t>
-      </w:r>
-      <w:r>
-        <w:rPr>
-          <w:sz w:val="22"/>
-        </w:rPr>
-        <w:t xml:space="preserve">: </w:t>
-      </w:r>
-      <w:r>
-        <w:rPr>
-          <w:sz w:val="22"/>
-        </w:rPr>
-        <w:t>die Schwester war „</w:t>
-      </w:r>
-      <w:proofErr w:type="spellStart"/>
-      <w:r>
-        <w:rPr>
-          <w:sz w:val="22"/>
-        </w:rPr>
-        <w:t>wirtin</w:t>
-      </w:r>
-      <w:proofErr w:type="spellEnd"/>
-      <w:r>
-        <w:rPr>
-          <w:sz w:val="22"/>
-        </w:rPr>
-        <w:t xml:space="preserve">“ im Haus des Grafen von Cilli </w:t>
-      </w:r>
-    </w:p>
-    <w:p>
-      <w:pPr>
-        <w:rPr>
-          <w:sz w:val="22"/>
-        </w:rPr>
-      </w:pPr>
-      <w:r>
-        <w:rPr>
-          <w:sz w:val="22"/>
-        </w:rPr>
-        <w:t xml:space="preserve">• </w:t>
-      </w:r>
-      <w:r>
-        <w:rPr>
-          <w:sz w:val="22"/>
-        </w:rPr>
-        <w:t>Rechtsgeschäft: Schenkung</w:t>
-      </w:r>
-      <w:r>
-        <w:rPr>
-          <w:sz w:val="22"/>
-        </w:rPr>
-        <w:t xml:space="preserve"> oder Erbe?</w:t>
       </w:r>
     </w:p>
     <w:sectPr>

</xml_diff>